<commit_message>
v3: TriviaQA as a second recall dataset; human-label validation kit
- TriviaQA (1,000 questions, judge-free alias labels, frozen protocol):
  D0 0.753 / 0.694 / 0.730, D2 0.70-0.81, difficulty proxy 0.81-0.86;
  detectability orders TriviaQA > SciQ > TruthfulQA. Paper section IV-G.
- labels/human/: 120-item blind annotation sheet (judge disagreements +
  controls), key, instructions; scripts/v3_human.py scores it
- 7B/8B scale check dropped (download time); model_utils loads
  pre-quantized checkpoints

Co-Authored-By: Claude Opus 5.5 <noreply@anthropic.com>
</commit_message>
<xml_diff>
--- a/paper/Learned_Falsehoods_Uncertainty_Paper.docx
+++ b/paper/Learned_Falsehoods_Uncertainty_Paper.docx
@@ -208,7 +208,7 @@
           <w:sz w:val="18"/>
           <w:szCs w:val="18"/>
         </w:rPr>
-        <w:t xml:space="preserve">Token-level uncertainty from a single generation is the cheapest hallucination signal available. We test whether it detects the wrong answers of three small instruction-tuned models (Qwen2.5-1.5B, Llama-3.2-1B, SmolLM2-1.7B) on TruthfulQA and SciQ, with raw greedy decoding, fp32 teacher-forced scoring, and an evaluation preregistered on a development split and run once on 1,417 held-out questions. Mean token log-probability detects errors weakly on SciQ (AUROC 0.66–0.70), largely through question difficulty, and is at chance on TruthfulQA for two models. The failure is specific: answers that repeat a popular misconception are scored like correct answers, while other errors are partly detectable (preregistered gap −0.16 and −0.18 for two models; −0.09, not significant, for the third). Post hoc, the same blind spot appears in the model's own true/false judgement and in entailment-based semantic entropy. For two models the gap survives controls for length, question familiarity, difficulty, topic and answer form, labels from an independent judge trained on human ratings, automatic error typing and a second prompt, and it persists in a model twice the size, and within a question the misconception is often the model's more probable answer. Abstaining on the least confident fifth of answers barely changes the TruthfulQA error rate for two models. Uncertainty read from the generating model measures what it has learned, not whether it is true.</w:t>
+        <w:t xml:space="preserve">Token-level uncertainty from a single generation is the cheapest hallucination signal available. We test whether it detects the wrong answers of three small instruction-tuned models (Qwen2.5-1.5B, Llama-3.2-1B, SmolLM2-1.7B) on TruthfulQA and SciQ, with raw greedy decoding, fp32 teacher-forced scoring, and an evaluation preregistered on a development split and run once on 1,417 held-out questions. Mean token log-probability detects errors weakly on SciQ (AUROC 0.66–0.70) and moderately on TriviaQA (0.69–0.75, post hoc), largely through question difficulty, and is at chance on TruthfulQA for two models. The failure is specific: answers that repeat a popular misconception are scored like correct answers, while other errors are partly detectable (preregistered gap −0.16 and −0.18 for two models; −0.09, not significant, for the third). Post hoc, the same blind spot appears in the model's own true/false judgement and in entailment-based semantic entropy. For two models the gap survives controls for length, question familiarity, difficulty, topic and answer form, labels from an independent judge trained on human ratings, automatic error typing and a second prompt, and it persists in a model twice the size, and within a question the misconception is often the model's more probable answer. Abstaining on the least confident fifth of answers barely changes the TruthfulQA error rate for two models. Uncertainty read from the generating model measures what it has learned, not whether it is true.</w:t>
       </w:r>
     </w:p>
     <w:p>
@@ -4813,7 +4813,40 @@
           <w:i/>
           <w:iCs/>
         </w:rPr>
-        <w:t xml:space="preserve">G. What Would a Detector Buy in Practice?</w:t>
+        <w:t xml:space="preserve">G. A Second Recall Dataset</w:t>
+      </w:r>
+    </w:p>
+    <w:p>
+      <w:pPr>
+        <w:spacing w:after="100" w:line="228"/>
+        <w:ind w:firstLine="288"/>
+        <w:jc w:val="both"/>
+      </w:pPr>
+      <w:r>
+        <w:t xml:space="preserve">To check that the SciQ picture is not specific to SciQ, we ran the frozen protocol post hoc on 1,000 TriviaQA questions [27] (200 dev, 800 confirm). An answer is labelled correct if it contains one of TriviaQA's answer aliases, a judge-free label that agrees with a stricter canonical-answer label on 94–95% of answers and, like containment on SciQ, rejects some correct paraphrases. D0 detects errors for all three models, more strongly than on SciQ (0.753, 0.694, 0.730, all Holm </w:t>
+      </w:r>
+      <w:r>
+        <w:rPr>
+          <w:i/>
+          <w:iCs/>
+        </w:rPr>
+        <w:t xml:space="preserve">p</w:t>
+      </w:r>
+      <w:r>
+        <w:t xml:space="preserve"> &lt; 0.001; 0.749, 0.706, 0.741 under the strict label), and the dev-trained D2 reaches 0.70–0.81. The question-difficulty proxy again does better (0.81–0.86), and a model's own D0 beats the other models' by +0.00 to +0.10. TriviaQA lists no misconceptions, and its errors are wrong specific names and terms, the kind of error uncertainty can partly see.</w:t>
+      </w:r>
+    </w:p>
+    <w:p>
+      <w:pPr>
+        <w:keepNext/>
+        <w:spacing w:after="60" w:before="100"/>
+      </w:pPr>
+      <w:r>
+        <w:rPr>
+          <w:i/>
+          <w:iCs/>
+        </w:rPr>
+        <w:t xml:space="preserve">H. What Would a Detector Buy in Practice?</w:t>
       </w:r>
     </w:p>
     <w:p>
@@ -4910,10 +4943,10 @@
           <w:i/>
           <w:iCs/>
         </w:rPr>
-        <w:t xml:space="preserve">Why the two datasets differ.</w:t>
-      </w:r>
-      <w:r>
-        <w:t xml:space="preserve"> SciQ errors are mostly gaps in knowledge: only 14–19% of them pick a listed distractor, the model does not know the term, and its uncertainty shows it, mainly at the level of how hard the question is. TruthfulQA errors are mostly learned falsehoods. The detectability of a dataset is then largely the mix of its error types, which is why the same feature is at chance for two models and weak for the third.</w:t>
+        <w:t xml:space="preserve">Why the datasets differ.</w:t>
+      </w:r>
+      <w:r>
+        <w:t xml:space="preserve"> SciQ errors are mostly gaps in knowledge: only 14–19% of them pick a listed distractor, the model does not know the term, and its uncertainty shows it, mainly at the level of how hard the question is. TruthfulQA errors are mostly learned falsehoods. The detectability of a dataset is then largely the mix of its error types: the same feature is moderate on TriviaQA, weak on SciQ and at chance on TruthfulQA for two of three models.</w:t>
       </w:r>
     </w:p>
     <w:p>
@@ -5081,7 +5114,7 @@
         <w:t xml:space="preserve">Generality.</w:t>
       </w:r>
       <w:r>
-        <w:t xml:space="preserve"> Three 1–2B models plus one 3B check (bf16, TruthfulQA only), short-answer English QA, greedy decoding with a 64-token limit, and two prompts; larger models, long-form generation and other domains may behave differently. The dev split was examined extensively, so dev numbers are exploratory.</w:t>
+        <w:t xml:space="preserve"> Three 1–2B models plus one 3B check (bf16, TruthfulQA only), three short-answer English QA datasets (TriviaQA post hoc, greedy answers only), greedy decoding with a 64-token limit, and two prompts; larger models, long-form generation and other domains may behave differently. The dev split was examined extensively, so dev numbers are exploratory.</w:t>
       </w:r>
     </w:p>
     <w:p>
@@ -6311,6 +6344,46 @@
           <w:szCs w:val="16"/>
         </w:rPr>
         <w:t xml:space="preserve">, vol. 6, no. 2, pp. 65–70, 1979.</w:t>
+      </w:r>
+    </w:p>
+    <w:p>
+      <w:pPr>
+        <w:tabs>
+          <w:tab w:val="left" w:pos="400"/>
+        </w:tabs>
+        <w:spacing w:after="40"/>
+        <w:ind w:left="400" w:hanging="400"/>
+        <w:jc w:val="both"/>
+      </w:pPr>
+      <w:r>
+        <w:rPr>
+          <w:sz w:val="16"/>
+          <w:szCs w:val="16"/>
+        </w:rPr>
+        <w:t xml:space="preserve">[27]	</w:t>
+      </w:r>
+      <w:r>
+        <w:rPr>
+          <w:sz w:val="16"/>
+          <w:szCs w:val="16"/>
+        </w:rPr>
+        <w:t xml:space="preserve">M. Joshi, E. Choi, D. S. Weld, and L. Zettlemoyer, “TriviaQA: A large scale distantly supervised challenge dataset for reading comprehension,” in </w:t>
+      </w:r>
+      <w:r>
+        <w:rPr>
+          <w:i/>
+          <w:iCs/>
+          <w:sz w:val="16"/>
+          <w:szCs w:val="16"/>
+        </w:rPr>
+        <w:t xml:space="preserve">Proc. ACL</w:t>
+      </w:r>
+      <w:r>
+        <w:rPr>
+          <w:sz w:val="16"/>
+          <w:szCs w:val="16"/>
+        </w:rPr>
+        <w:t xml:space="preserve">, 2017, pp. 1601–1611, doi: 10.18653/v1/P17-1147.</w:t>
       </w:r>
     </w:p>
     <w:sectPr>

</xml_diff>

<commit_message>
v3: demo rebuilt on the clean protocol; D2 mechanism analysis; DA3 demo guide
- scripts/demo_app.py: live raw-greedy answer with fp32 re-scoring, token map,
  D0/D2 against the confirm-split distribution and measured AUROC; recorded-answer
  browser and findings tab that need no GPU. Replaces the v1 demo (proxy-label
  classifier, arbitrary PASS/WARN/FLAG thresholds).
- scripts/v3_d2_mechanism.py (exploratory): D2 scores a "fluent answer, one
  improbable token" contrast; it detects non-imitative TruthfulQA errors
  (0.70-0.76) but not imitative ones; one sentence added to the paper (6 pages).
- DEMO.md: run checklist, five-minute walkthrough, likely review questions.
- token_viz: explicit dark text so the token map is readable in dark mode.
- Re-ran v2_analysis, v2_confirm, v3_audit, v3_constants: outputs byte-identical.

Co-Authored-By: Claude Opus 5.5 <noreply@anthropic.com>
Claude-Session: https://claude.ai/code/session_01GsVy8bdyo8J8ZUC7ATQPR3
</commit_message>
<xml_diff>
--- a/paper/Learned_Falsehoods_Uncertainty_Paper.docx
+++ b/paper/Learned_Falsehoods_Uncertainty_Paper.docx
@@ -2999,7 +2999,17 @@
         <w:t xml:space="preserve">p</w:t>
       </w:r>
       <w:r>
-        <w:t xml:space="preserve"> ≤ 0.017) and detects errors for all three models on TruthfulQA (0.60–0.73). It is not an answer-length proxy: a dev-trained length model scores 0.50–0.57, D2 adds +0.04 to +0.22 to it, and D2's AUROC within answer-length quintiles is within 0.01 of its raw value. The 17-feature D3 is never clearly better than D2. Part of D2's TruthfulQA gain is specific to that dataset: the same three features trained on SciQ dev reach only 0.54–0.72 on TruthfulQA confirm.</w:t>
+        <w:t xml:space="preserve"> ≤ 0.017) and detects errors for all three models on TruthfulQA (0.60–0.73). It is not an answer-length proxy: a dev-trained length model scores 0.50–0.57, D2 adds +0.04 to +0.22 to it, and D2's AUROC within answer-length quintiles is within 0.01 of its raw value. The 17-feature D3 is never clearly better than D2. Part of D2's TruthfulQA gain is specific to that dataset: the same three features trained on SciQ dev reach only 0.54–0.72 on TruthfulQA confirm. Post hoc, its weights (positive on mean log-probability </w:t>
+      </w:r>
+      <w:r>
+        <w:rPr>
+          <w:i/>
+          <w:iCs/>
+        </w:rPr>
+        <w:t xml:space="preserve">and</w:t>
+      </w:r>
+      <w:r>
+        <w:t xml:space="preserve"> mean entropy, negative on minimum) point to a contrast, not low confidence: mean − minimum log-probability (fluent overall, one improbable token) detects the non-imitative TruthfulQA errors at 0.70–0.76 (D0: 0.58–0.71) but is at chance on imitative ones for Qwen and SmolLM2 (0.49, 0.52; Llama 0.67).</w:t>
       </w:r>
     </w:p>
     <w:p>

</xml_diff>